<commit_message>
resume renamed to resume1.pdf updated
</commit_message>
<xml_diff>
--- a/docs/resume.docx
+++ b/docs/resume.docx
@@ -506,7 +506,7 @@
           </mc:Choice>
           <mc:Fallback>
             <w:pict>
-              <v:shapetype w14:anchorId="69543F4C" id="_x0000_t120" coordsize="21600,21600" o:spt="120" path="m10800,qx,10800,10800,21600,21600,10800,10800,xe">
+              <v:shapetype w14:anchorId="36936306" id="_x0000_t120" coordsize="21600,21600" o:spt="120" path="m10800,qx,10800,10800,21600,21600,10800,10800,xe">
                 <v:path gradientshapeok="t" o:connecttype="custom" o:connectlocs="10800,0;3163,3163;0,10800;3163,18437;10800,21600;18437,18437;21600,10800;18437,3163" textboxrect="3163,3163,18437,18437"/>
               </v:shapetype>
               <v:shape id="photo" o:spid="_x0000_s1026" type="#_x0000_t120" style="position:absolute;margin-left:6pt;margin-top:-9.5pt;width:121pt;height:121.5pt;z-index:251651072;visibility:visible;mso-wrap-style:square;mso-width-percent:0;mso-height-percent:0;mso-wrap-distance-left:9pt;mso-wrap-distance-top:0;mso-wrap-distance-right:9pt;mso-wrap-distance-bottom:0;mso-position-horizontal:absolute;mso-position-horizontal-relative:margin;mso-position-vertical:absolute;mso-position-vertical-relative:text;mso-width-percent:0;mso-height-percent:0;mso-width-relative:margin;mso-height-relative:margin;v-text-anchor:middle" o:gfxdata="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" stroked="f" strokeweight="1pt">
@@ -1104,13 +1104,25 @@
                                 <w:rPr>
                                   <w:color w:val="FFFFFF" w:themeColor="background1"/>
                                 </w:rPr>
-                                <w:t>+91 9</w:t>
+                                <w:t xml:space="preserve">+91 </w:t>
                               </w:r>
                               <w:r>
                                 <w:rPr>
                                   <w:color w:val="FFFFFF" w:themeColor="background1"/>
                                 </w:rPr>
-                                <w:t>128477353</w:t>
+                                <w:t>9</w:t>
+                              </w:r>
+                              <w:r>
+                                <w:rPr>
+                                  <w:color w:val="FFFFFF" w:themeColor="background1"/>
+                                </w:rPr>
+                                <w:t>1284</w:t>
+                              </w:r>
+                              <w:r>
+                                <w:rPr>
+                                  <w:color w:val="FFFFFF" w:themeColor="background1"/>
+                                </w:rPr>
+                                <w:t>7xxxx</w:t>
                               </w:r>
                             </w:p>
                           </w:txbxContent>
@@ -1153,13 +1165,25 @@
                           <w:rPr>
                             <w:color w:val="FFFFFF" w:themeColor="background1"/>
                           </w:rPr>
-                          <w:t>+91 9</w:t>
+                          <w:t xml:space="preserve">+91 </w:t>
                         </w:r>
                         <w:r>
                           <w:rPr>
                             <w:color w:val="FFFFFF" w:themeColor="background1"/>
                           </w:rPr>
-                          <w:t>128477353</w:t>
+                          <w:t>9</w:t>
+                        </w:r>
+                        <w:r>
+                          <w:rPr>
+                            <w:color w:val="FFFFFF" w:themeColor="background1"/>
+                          </w:rPr>
+                          <w:t>1284</w:t>
+                        </w:r>
+                        <w:r>
+                          <w:rPr>
+                            <w:color w:val="FFFFFF" w:themeColor="background1"/>
+                          </w:rPr>
+                          <w:t>7xxxx</w:t>
                         </w:r>
                       </w:p>
                     </w:txbxContent>

</xml_diff>